<commit_message>
proposal file name as eventdate_status_name and store file_name in BDProposal History
</commit_message>
<xml_diff>
--- a/estimate_perday_template.docx
+++ b/estimate_perday_template.docx
@@ -1367,7 +1367,25 @@
                 <w:lang w:val="en-US"/>
               </w:rPr>
               <w:br/>
-              <w:t>{{EVENT_GUESTS}} Guests</w:t>
+              <w:t>{{</w:t>
+            </w:r>
+            <w:r>
+              <w:rPr>
+                <w:rFonts w:ascii="Open Sans" w:eastAsia="Aptos" w:hAnsi="Open Sans" w:cs="Open Sans"/>
+                <w:sz w:val="17"/>
+                <w:szCs w:val="17"/>
+                <w:lang w:val="en-US"/>
+              </w:rPr>
+              <w:t>DAILY_GUESTS</w:t>
+            </w:r>
+            <w:r>
+              <w:rPr>
+                <w:rFonts w:ascii="Open Sans" w:eastAsia="Aptos" w:hAnsi="Open Sans" w:cs="Open Sans"/>
+                <w:sz w:val="17"/>
+                <w:szCs w:val="17"/>
+                <w:lang w:val="en-US"/>
+              </w:rPr>
+              <w:t>}} Guests</w:t>
             </w:r>
           </w:p>
           <w:p>
@@ -1837,25 +1855,14 @@
                 <w:lang w:val="en-US"/>
               </w:rPr>
             </w:pPr>
-            <w:proofErr w:type="spellStart"/>
-            <w:r>
-              <w:rPr>
-                <w:rFonts w:ascii="Open Sans" w:eastAsia="Aptos" w:hAnsi="Open Sans" w:cs="Open Sans"/>
-                <w:sz w:val="16"/>
-                <w:szCs w:val="16"/>
-                <w:lang w:val="en-US"/>
-              </w:rPr>
-              <w:t>Foodesign</w:t>
-            </w:r>
-            <w:proofErr w:type="spellEnd"/>
-            <w:r>
-              <w:rPr>
-                <w:rFonts w:ascii="Open Sans" w:eastAsia="Aptos" w:hAnsi="Open Sans" w:cs="Open Sans"/>
-                <w:sz w:val="16"/>
-                <w:szCs w:val="16"/>
-                <w:lang w:val="en-US"/>
-              </w:rPr>
-              <w:t xml:space="preserve"> Conceptual Events and the Client acknowledge and agree that this proposal is governed by the Master Caterer Agreement executed between the parties.</w:t>
+            <w:r>
+              <w:rPr>
+                <w:rFonts w:ascii="Open Sans" w:eastAsia="Aptos" w:hAnsi="Open Sans" w:cs="Open Sans"/>
+                <w:sz w:val="16"/>
+                <w:szCs w:val="16"/>
+                <w:lang w:val="en-US"/>
+              </w:rPr>
+              <w:t>Foodesign Conceptual Events and the Client acknowledge and agree that this proposal is governed by the Master Caterer Agreement executed between the parties.</w:t>
             </w:r>
           </w:p>
           <w:p>
@@ -1910,27 +1917,7 @@
                 <w:szCs w:val="16"/>
                 <w:lang w:val="en-US"/>
               </w:rPr>
-              <w:t xml:space="preserve">The undersigned, as a duly authorized representative of the Client, {{CLIENT_NAME}}, hereby contract the services of </w:t>
-            </w:r>
-            <w:proofErr w:type="spellStart"/>
-            <w:r>
-              <w:rPr>
-                <w:rFonts w:ascii="Open Sans" w:eastAsia="Aptos" w:hAnsi="Open Sans" w:cs="Open Sans"/>
-                <w:sz w:val="16"/>
-                <w:szCs w:val="16"/>
-                <w:lang w:val="en-US"/>
-              </w:rPr>
-              <w:t>Foodesign</w:t>
-            </w:r>
-            <w:proofErr w:type="spellEnd"/>
-            <w:r>
-              <w:rPr>
-                <w:rFonts w:ascii="Open Sans" w:eastAsia="Aptos" w:hAnsi="Open Sans" w:cs="Open Sans"/>
-                <w:sz w:val="16"/>
-                <w:szCs w:val="16"/>
-                <w:lang w:val="en-US"/>
-              </w:rPr>
-              <w:t xml:space="preserve"> Conceptual Events as listed and quoted in this proposal on behalf of the Client according to the terms and conditions herein.</w:t>
+              <w:t>The undersigned, as a duly authorized representative of the Client, {{CLIENT_NAME}}, hereby contract the services of Foodesign Conceptual Events as listed and quoted in this proposal on behalf of the Client according to the terms and conditions herein.</w:t>
             </w:r>
           </w:p>
           <w:p>
@@ -2189,7 +2176,6 @@
                 <w:lang w:val="en-US"/>
               </w:rPr>
             </w:pPr>
-            <w:proofErr w:type="spellStart"/>
             <w:r>
               <w:rPr>
                 <w:rFonts w:ascii="Open Sans" w:eastAsia="Aptos" w:hAnsi="Open Sans" w:cs="Open Sans"/>
@@ -2199,19 +2185,7 @@
                 <w:szCs w:val="16"/>
                 <w:lang w:val="en-US"/>
               </w:rPr>
-              <w:t>Foodesign</w:t>
-            </w:r>
-            <w:proofErr w:type="spellEnd"/>
-            <w:r>
-              <w:rPr>
-                <w:rFonts w:ascii="Open Sans" w:eastAsia="Aptos" w:hAnsi="Open Sans" w:cs="Open Sans"/>
-                <w:b/>
-                <w:bCs/>
-                <w:sz w:val="16"/>
-                <w:szCs w:val="16"/>
-                <w:lang w:val="en-US"/>
-              </w:rPr>
-              <w:t xml:space="preserve"> Conceptual Events Policies</w:t>
+              <w:t>Foodesign Conceptual Events Policies</w:t>
             </w:r>
           </w:p>
           <w:p>
@@ -2446,25 +2420,14 @@
                 <w:lang w:val="en-US"/>
               </w:rPr>
             </w:pPr>
-            <w:proofErr w:type="spellStart"/>
-            <w:r>
-              <w:rPr>
-                <w:rFonts w:ascii="Open Sans" w:eastAsia="Aptos" w:hAnsi="Open Sans" w:cs="Open Sans"/>
-                <w:sz w:val="16"/>
-                <w:szCs w:val="16"/>
-                <w:lang w:val="en-US"/>
-              </w:rPr>
-              <w:t>Foodesign</w:t>
-            </w:r>
-            <w:proofErr w:type="spellEnd"/>
-            <w:r>
-              <w:rPr>
-                <w:rFonts w:ascii="Open Sans" w:eastAsia="Aptos" w:hAnsi="Open Sans" w:cs="Open Sans"/>
-                <w:sz w:val="16"/>
-                <w:szCs w:val="16"/>
-                <w:lang w:val="en-US"/>
-              </w:rPr>
-              <w:t xml:space="preserve"> Conceptual Events accept cash, MasterCard, Visa, Amex or Personal Checks as Payment Options. If Mastercard, Visa, or AMEX is the preferred payment method, a 3.8% credit card fee will be added to the total amount.</w:t>
+            <w:r>
+              <w:rPr>
+                <w:rFonts w:ascii="Open Sans" w:eastAsia="Aptos" w:hAnsi="Open Sans" w:cs="Open Sans"/>
+                <w:sz w:val="16"/>
+                <w:szCs w:val="16"/>
+                <w:lang w:val="en-US"/>
+              </w:rPr>
+              <w:t>Foodesign Conceptual Events accept cash, MasterCard, Visa, Amex or Personal Checks as Payment Options. If Mastercard, Visa, or AMEX is the preferred payment method, a 3.8% credit card fee will be added to the total amount.</w:t>
             </w:r>
           </w:p>
           <w:p>
@@ -2483,25 +2446,14 @@
                 <w:lang w:val="en-US"/>
               </w:rPr>
             </w:pPr>
-            <w:proofErr w:type="spellStart"/>
-            <w:r>
-              <w:rPr>
-                <w:rFonts w:ascii="Open Sans" w:eastAsia="Aptos" w:hAnsi="Open Sans" w:cs="Open Sans"/>
-                <w:sz w:val="16"/>
-                <w:szCs w:val="16"/>
-                <w:lang w:val="en-US"/>
-              </w:rPr>
-              <w:t>Foodesign</w:t>
-            </w:r>
-            <w:proofErr w:type="spellEnd"/>
-            <w:r>
-              <w:rPr>
-                <w:rFonts w:ascii="Open Sans" w:eastAsia="Aptos" w:hAnsi="Open Sans" w:cs="Open Sans"/>
-                <w:sz w:val="16"/>
-                <w:szCs w:val="16"/>
-                <w:lang w:val="en-US"/>
-              </w:rPr>
-              <w:t xml:space="preserve"> Conceptual Events will not be liable for a failure to perform this contract due to delays, strikes, storms, accidents, venue accessibility, or other causes beyond its control</w:t>
+            <w:r>
+              <w:rPr>
+                <w:rFonts w:ascii="Open Sans" w:eastAsia="Aptos" w:hAnsi="Open Sans" w:cs="Open Sans"/>
+                <w:sz w:val="16"/>
+                <w:szCs w:val="16"/>
+                <w:lang w:val="en-US"/>
+              </w:rPr>
+              <w:t>Foodesign Conceptual Events will not be liable for a failure to perform this contract due to delays, strikes, storms, accidents, venue accessibility, or other causes beyond its control</w:t>
             </w:r>
           </w:p>
           <w:p>
@@ -4301,7 +4253,6 @@
   <w:style w:type="character" w:default="1" w:styleId="Fuentedeprrafopredeter">
     <w:name w:val="Default Paragraph Font"/>
     <w:uiPriority w:val="1"/>
-    <w:semiHidden/>
     <w:unhideWhenUsed/>
   </w:style>
   <w:style w:type="table" w:default="1" w:styleId="Tablanormal">

</xml_diff>